<commit_message>
fix: seperate filling and ranked value
</commit_message>
<xml_diff>
--- a/assets/experience.docx
+++ b/assets/experience.docx
@@ -7,19 +7,38 @@
         <w:pStyle w:val="NormalWeb"/>
         <w:spacing w:before="0" w:beforeAutospacing="0" w:after="0" w:afterAutospacing="0"/>
         <w:rPr>
-          <w:rFonts w:ascii="Calibri" w:hAnsi="Calibri" w:cs="Calibri"/>
-          <w:color w:val="767676"/>
-          <w:sz w:val="20"/>
-          <w:szCs w:val="20"/>
-        </w:rPr>
-      </w:pPr>
-      <w:r>
-        <w:rPr>
           <w:rFonts w:ascii="Calibri Light" w:hAnsi="Calibri Light" w:cs="Calibri Light"/>
           <w:sz w:val="40"/>
           <w:szCs w:val="40"/>
         </w:rPr>
+      </w:pPr>
+      <w:r>
+        <w:rPr>
+          <w:rFonts w:ascii="Calibri Light" w:hAnsi="Calibri Light" w:cs="Calibri Light"/>
+          <w:sz w:val="40"/>
+          <w:szCs w:val="40"/>
+        </w:rPr>
         <w:t>Work Experience</w:t>
+      </w:r>
+    </w:p>
+    <w:p>
+      <w:pPr>
+        <w:pStyle w:val="NormalWeb"/>
+        <w:spacing w:before="0" w:beforeAutospacing="0" w:after="0" w:afterAutospacing="0"/>
+        <w:rPr>
+          <w:rFonts w:ascii="Calibri" w:hAnsi="Calibri" w:cs="Calibri"/>
+          <w:color w:val="767676"/>
+          <w:sz w:val="36"/>
+          <w:szCs w:val="36"/>
+        </w:rPr>
+      </w:pPr>
+      <w:r>
+        <w:rPr>
+          <w:rFonts w:ascii="Calibri Light" w:hAnsi="Calibri Light" w:cs="Calibri Light"/>
+          <w:sz w:val="36"/>
+          <w:szCs w:val="36"/>
+        </w:rPr>
+        <w:t>Currently on H1B Visa</w:t>
       </w:r>
     </w:p>
     <w:p>
@@ -685,6 +704,7 @@
         <w:rPr>
           <w:rFonts w:ascii="Aptos" w:eastAsia="Times New Roman" w:hAnsi="Aptos" w:cs="Calibri"/>
         </w:rPr>
+        <w:lastRenderedPageBreak/>
         <w:t>Bundling strategy in webpack and lazy loading components</w:t>
       </w:r>
     </w:p>
@@ -701,7 +721,6 @@
         <w:rPr>
           <w:rFonts w:ascii="Aptos" w:hAnsi="Aptos" w:cs="Calibri"/>
         </w:rPr>
-        <w:lastRenderedPageBreak/>
         <w:t> </w:t>
       </w:r>
     </w:p>
@@ -1351,6 +1370,7 @@
           <w:b/>
           <w:bCs/>
         </w:rPr>
+        <w:lastRenderedPageBreak/>
         <w:t>As an individual developer:</w:t>
       </w:r>
     </w:p>
@@ -1372,7 +1392,6 @@
         <w:rPr>
           <w:rFonts w:ascii="Aptos" w:eastAsia="Times New Roman" w:hAnsi="Aptos" w:cs="Calibri"/>
         </w:rPr>
-        <w:lastRenderedPageBreak/>
         <w:t>Worked on components of pages, analytics, hooks, and URQL.</w:t>
       </w:r>
     </w:p>
@@ -1838,6 +1857,7 @@
         <w:rPr>
           <w:rFonts w:ascii="Aptos" w:hAnsi="Aptos" w:cs="Calibri"/>
         </w:rPr>
+        <w:lastRenderedPageBreak/>
         <w:t> </w:t>
       </w:r>
     </w:p>
@@ -1859,7 +1879,6 @@
         <w:rPr>
           <w:rFonts w:ascii="Aptos" w:eastAsia="Times New Roman" w:hAnsi="Aptos" w:cs="Calibri"/>
         </w:rPr>
-        <w:lastRenderedPageBreak/>
         <w:t>Set up repositories for all responsible products and micro frontend application integeration.</w:t>
       </w:r>
     </w:p>

</xml_diff>